<commit_message>
docs(evidencias): actualiza autoevaluaciones y diarios de reflexion de Fase 1 y Fase 2 al estado real del proyecto
</commit_message>
<xml_diff>
--- a/docs/fase1/evidencias_individuales/VERGARA_ANDRES_1.2_APT122_DiarioReflexionFase1.docx
+++ b/docs/fase1/evidencias_individuales/VERGARA_ANDRES_1.2_APT122_DiarioReflexionFase1.docx
@@ -210,23 +210,7 @@
                 <w:sz w:val="24"/>
                 <w:szCs w:val="24"/>
               </w:rPr>
-              <w:t>Puedes responder en cada una de las secciones por pregunta e</w:t>
-            </w:r>
-            <w:r>
-              <w:rPr>
-                <w:rFonts w:eastAsiaTheme="majorEastAsia"/>
-                <w:sz w:val="24"/>
-                <w:szCs w:val="24"/>
-              </w:rPr>
-              <w:t xml:space="preserve">n </w:t>
-            </w:r>
-            <w:r>
-              <w:rPr>
-                <w:rFonts w:eastAsiaTheme="majorEastAsia"/>
-                <w:sz w:val="24"/>
-                <w:szCs w:val="24"/>
-              </w:rPr>
-              <w:t>esta guía y, posteriormente, cargarla en la sección de reflexión de la Fase 1, para retroalimentación de tu docente.</w:t>
+              <w:t xml:space="preserve">Puedes responder en cada una de las secciones por pregunta en esta guía y, posteriormente, cargarla en la sección de reflexión de la Fase 1, para retroalimentación de tu docente.</w:t>
             </w:r>
           </w:p>
         </w:tc>
@@ -345,119 +329,7 @@
                 <w:sz w:val="24"/>
                 <w:szCs w:val="24"/>
               </w:rPr>
-              <w:t xml:space="preserve">Las asignaturas </w:t>
-            </w:r>
-            <w:r>
-              <w:rPr>
-                <w:color w:val="000000"/>
-                <w:sz w:val="24"/>
-                <w:szCs w:val="24"/>
-              </w:rPr>
-              <w:t>que más me gustaron</w:t>
-            </w:r>
-            <w:r>
-              <w:rPr>
-                <w:color w:val="000000"/>
-                <w:sz w:val="24"/>
-                <w:szCs w:val="24"/>
-              </w:rPr>
-              <w:t xml:space="preserve"> </w:t>
-            </w:r>
-            <w:r>
-              <w:rPr>
-                <w:color w:val="000000"/>
-                <w:sz w:val="24"/>
-                <w:szCs w:val="24"/>
-              </w:rPr>
-              <w:t>y</w:t>
-            </w:r>
-            <w:r>
-              <w:rPr>
-                <w:color w:val="000000"/>
-                <w:sz w:val="24"/>
-                <w:szCs w:val="24"/>
-              </w:rPr>
-              <w:t xml:space="preserve"> que </w:t>
-            </w:r>
-            <w:r>
-              <w:rPr>
-                <w:color w:val="000000"/>
-                <w:sz w:val="24"/>
-                <w:szCs w:val="24"/>
-              </w:rPr>
-              <w:t xml:space="preserve">más </w:t>
-            </w:r>
-            <w:r>
-              <w:rPr>
-                <w:color w:val="000000"/>
-                <w:sz w:val="24"/>
-                <w:szCs w:val="24"/>
-              </w:rPr>
-              <w:t xml:space="preserve">se relacionan </w:t>
-            </w:r>
-            <w:r>
-              <w:rPr>
-                <w:color w:val="000000"/>
-                <w:sz w:val="24"/>
-                <w:szCs w:val="24"/>
-              </w:rPr>
-              <w:t xml:space="preserve">con </w:t>
-            </w:r>
-            <w:r>
-              <w:rPr>
-                <w:color w:val="000000"/>
-                <w:sz w:val="24"/>
-                <w:szCs w:val="24"/>
-              </w:rPr>
-              <w:t>mis intereses profesionales</w:t>
-            </w:r>
-            <w:r>
-              <w:rPr>
-                <w:color w:val="000000"/>
-                <w:sz w:val="24"/>
-                <w:szCs w:val="24"/>
-              </w:rPr>
-              <w:t xml:space="preserve"> </w:t>
-            </w:r>
-            <w:r>
-              <w:rPr>
-                <w:color w:val="000000"/>
-                <w:sz w:val="24"/>
-                <w:szCs w:val="24"/>
-              </w:rPr>
-              <w:t xml:space="preserve">son </w:t>
-            </w:r>
-            <w:r>
-              <w:rPr>
-                <w:color w:val="000000"/>
-                <w:sz w:val="24"/>
-                <w:szCs w:val="24"/>
-              </w:rPr>
-              <w:t>Gestión de Proyectos Informáticos</w:t>
-            </w:r>
-            <w:r>
-              <w:rPr>
-                <w:color w:val="000000"/>
-                <w:sz w:val="24"/>
-                <w:szCs w:val="24"/>
-              </w:rPr>
-              <w:t>,</w:t>
-            </w:r>
-            <w:r>
-              <w:rPr>
-                <w:color w:val="000000"/>
-                <w:sz w:val="24"/>
-                <w:szCs w:val="24"/>
-              </w:rPr>
-              <w:t xml:space="preserve"> Gestión de Riesgos, </w:t>
-            </w:r>
-            <w:r>
-              <w:rPr>
-                <w:color w:val="000000"/>
-                <w:sz w:val="24"/>
-                <w:szCs w:val="24"/>
-              </w:rPr>
-              <w:t>Sistemas de Información en Salud, Codificación en Información Clínica y Sistemas de Vigilancia Epidemiológica. Todas ellas se conectan con mi interés por la salud digital, porque me permiten comprender cómo planificar soluciones tecnológicas, gestionar riesgos, organizar información clínica y utilizar datos para apoyar la prevención, el monitoreo y la toma de decisiones en salud. Estas asignaturas también se vinculan directamente con DomoVida, ya que el proyecto combina gestión, tecnología, datos clínicos e innovación aplicada al cuidado domiciliario del adulto mayor.</w:t>
+              <w:t xml:space="preserve">Las asignaturas que más me gustaron y que más se relacionan con mis intereses profesionales son Gestión de Proyectos Informáticos, Gestión de Riesgos, Sistemas de Información en Salud, Codificación en Información Clínica y Sistemas de Vigilancia Epidemiológica. Todas ellas se conectan con mi interés por la salud digital, porque me permiten comprender cómo planificar soluciones tecnológicas, gestionar riesgos, organizar información clínica y utilizar datos para apoyar la prevención, el monitoreo y la toma de decisiones en salud. Estas asignaturas también se vinculan directamente con DomoVida, ya que el proyecto combina gestión, tecnología, datos clínicos e innovación aplicada al cuidado domiciliario del adulto mayor.</w:t>
             </w:r>
           </w:p>
           <w:p>
@@ -696,177 +568,7 @@
                 <w:sz w:val="24"/>
                 <w:szCs w:val="24"/>
               </w:rPr>
-              <w:t>Sí, existe un valor inmenso en las certificaciones obtenidas, tanto de Duoc UC como de instituciones externas</w:t>
-            </w:r>
-            <w:r>
-              <w:rPr>
-                <w:color w:val="000000"/>
-                <w:sz w:val="24"/>
-                <w:szCs w:val="24"/>
-              </w:rPr>
-              <w:t>, porque no solo respaldan conocimientos, sino que también evidencian una trayectoria de aprendizaje continuo.</w:t>
-            </w:r>
-            <w:r>
-              <w:rPr>
-                <w:color w:val="000000"/>
-                <w:sz w:val="24"/>
-                <w:szCs w:val="24"/>
-              </w:rPr>
-              <w:t xml:space="preserve"> Los certificados modulares de Duoc UC avalan mis competencias técnicas en desarrollo de software, arquitectura, modelamiento de datos, inteligencia de negocios, gestión de proyectos y calidad de software. Las certificaciones de Google me han entregado herramientas prácticas y metodologías actuales, mientras que las certificaciones de la UC, </w:t>
-            </w:r>
-            <w:proofErr w:type="spellStart"/>
-            <w:r>
-              <w:rPr>
-                <w:color w:val="000000"/>
-                <w:sz w:val="24"/>
-                <w:szCs w:val="24"/>
-              </w:rPr>
-              <w:t>UChile</w:t>
-            </w:r>
-            <w:proofErr w:type="spellEnd"/>
-            <w:r>
-              <w:rPr>
-                <w:color w:val="000000"/>
-                <w:sz w:val="24"/>
-                <w:szCs w:val="24"/>
-              </w:rPr>
-              <w:t xml:space="preserve">, Universidad Austral, Universidad de los Andes, </w:t>
-            </w:r>
-            <w:proofErr w:type="spellStart"/>
-            <w:r>
-              <w:rPr>
-                <w:color w:val="000000"/>
-                <w:sz w:val="24"/>
-                <w:szCs w:val="24"/>
-              </w:rPr>
-              <w:t>University</w:t>
-            </w:r>
-            <w:proofErr w:type="spellEnd"/>
-            <w:r>
-              <w:rPr>
-                <w:color w:val="000000"/>
-                <w:sz w:val="24"/>
-                <w:szCs w:val="24"/>
-              </w:rPr>
-              <w:t xml:space="preserve"> </w:t>
-            </w:r>
-            <w:proofErr w:type="spellStart"/>
-            <w:r>
-              <w:rPr>
-                <w:color w:val="000000"/>
-                <w:sz w:val="24"/>
-                <w:szCs w:val="24"/>
-              </w:rPr>
-              <w:t>of</w:t>
-            </w:r>
-            <w:proofErr w:type="spellEnd"/>
-            <w:r>
-              <w:rPr>
-                <w:color w:val="000000"/>
-                <w:sz w:val="24"/>
-                <w:szCs w:val="24"/>
-              </w:rPr>
-              <w:t xml:space="preserve"> Virginia y </w:t>
-            </w:r>
-            <w:proofErr w:type="spellStart"/>
-            <w:r>
-              <w:rPr>
-                <w:color w:val="000000"/>
-                <w:sz w:val="24"/>
-                <w:szCs w:val="24"/>
-              </w:rPr>
-              <w:t>University</w:t>
-            </w:r>
-            <w:proofErr w:type="spellEnd"/>
-            <w:r>
-              <w:rPr>
-                <w:color w:val="000000"/>
-                <w:sz w:val="24"/>
-                <w:szCs w:val="24"/>
-              </w:rPr>
-              <w:t xml:space="preserve"> </w:t>
-            </w:r>
-            <w:proofErr w:type="spellStart"/>
-            <w:r>
-              <w:rPr>
-                <w:color w:val="000000"/>
-                <w:sz w:val="24"/>
-                <w:szCs w:val="24"/>
-              </w:rPr>
-              <w:t>of</w:t>
-            </w:r>
-            <w:proofErr w:type="spellEnd"/>
-            <w:r>
-              <w:rPr>
-                <w:color w:val="000000"/>
-                <w:sz w:val="24"/>
-                <w:szCs w:val="24"/>
-              </w:rPr>
-              <w:t xml:space="preserve"> California, Irvine fortalecen mi visión en salud digital, interoperabilida</w:t>
-            </w:r>
-            <w:r>
-              <w:rPr>
-                <w:color w:val="000000"/>
-                <w:sz w:val="24"/>
-                <w:szCs w:val="24"/>
-              </w:rPr>
-              <w:t xml:space="preserve">d clínica, análisis de datos, liderazgo y gestión. En conjunto, estas certificaciones </w:t>
-            </w:r>
-            <w:r>
-              <w:rPr>
-                <w:color w:val="000000"/>
-                <w:sz w:val="24"/>
-                <w:szCs w:val="24"/>
-              </w:rPr>
-              <w:t>validan mi perfil</w:t>
-            </w:r>
-            <w:r>
-              <w:rPr>
-                <w:color w:val="000000"/>
-                <w:sz w:val="24"/>
-                <w:szCs w:val="24"/>
-              </w:rPr>
-              <w:t xml:space="preserve"> como un profesional </w:t>
-            </w:r>
-            <w:r>
-              <w:rPr>
-                <w:color w:val="000000"/>
-                <w:sz w:val="24"/>
-                <w:szCs w:val="24"/>
-              </w:rPr>
-              <w:t xml:space="preserve">capaz de </w:t>
-            </w:r>
-            <w:r>
-              <w:rPr>
-                <w:color w:val="000000"/>
-                <w:sz w:val="24"/>
-                <w:szCs w:val="24"/>
-              </w:rPr>
-              <w:t>abordar</w:t>
-            </w:r>
-            <w:r>
-              <w:rPr>
-                <w:color w:val="000000"/>
-                <w:sz w:val="24"/>
-                <w:szCs w:val="24"/>
-              </w:rPr>
-              <w:t xml:space="preserve"> proyectos de salud digital con </w:t>
-            </w:r>
-            <w:r>
-              <w:rPr>
-                <w:color w:val="000000"/>
-                <w:sz w:val="24"/>
-                <w:szCs w:val="24"/>
-              </w:rPr>
-              <w:t>una visión integral, actualizada y estratégica</w:t>
-            </w:r>
-            <w:r>
-              <w:rPr>
-                <w:color w:val="000000"/>
-                <w:sz w:val="24"/>
-                <w:szCs w:val="24"/>
-              </w:rPr>
-              <w:t>.</w:t>
+              <w:t xml:space="preserve">Sí, existe un gran valor en las certificaciones obtenidas, tanto de Duoc UC como de instituciones externas, porque no solo respaldan conocimientos, sino que también evidencian una trayectoria de aprendizaje continuo. Los certificados modulares de Duoc UC avalan mis competencias técnicas en desarrollo de software, arquitectura, modelamiento de datos, inteligencia de negocios, gestión de proyectos y calidad de software. Las certificaciones de Google me han entregado herramientas prácticas y metodologías actuales, mientras que las certificaciones de la UC, UChile, Universidad Austral, Universidad de los Andes, University of Virginia y University of California, Irvine fortalecen mi visión en salud digital, interoperabilidad clínica, análisis de datos, liderazgo y gestión. En conjunto, estas certificaciones validan mi perfil como un profesional capaz de abordar proyectos de salud digital con una visión integral, actualizada y estratégica.</w:t>
             </w:r>
           </w:p>
           <w:p>
@@ -1231,89 +933,7 @@
                 <w:sz w:val="24"/>
                 <w:szCs w:val="24"/>
               </w:rPr>
-              <w:t xml:space="preserve"> </w:t>
-            </w:r>
-            <w:r>
-              <w:rPr>
-                <w:color w:val="000000"/>
-                <w:sz w:val="24"/>
-                <w:szCs w:val="24"/>
-              </w:rPr>
-              <w:t xml:space="preserve">Considero </w:t>
-            </w:r>
-            <w:r>
-              <w:rPr>
-                <w:color w:val="000000"/>
-                <w:sz w:val="24"/>
-                <w:szCs w:val="24"/>
-              </w:rPr>
-              <w:t>que tengo más desarrolladas las competencias asociadas al</w:t>
-            </w:r>
-            <w:r>
-              <w:rPr>
-                <w:color w:val="000000"/>
-                <w:sz w:val="24"/>
-                <w:szCs w:val="24"/>
-              </w:rPr>
-              <w:t xml:space="preserve"> desarrollo de software sistemático, el modelamiento de datos y sistemas de información clínica, la gestión de proyectos, y las pruebas de certificación y calidad. Me siento</w:t>
-            </w:r>
-            <w:r>
-              <w:rPr>
-                <w:color w:val="000000"/>
-                <w:sz w:val="24"/>
-                <w:szCs w:val="24"/>
-              </w:rPr>
-              <w:t xml:space="preserve"> muy</w:t>
-            </w:r>
-            <w:r>
-              <w:rPr>
-                <w:color w:val="000000"/>
-                <w:sz w:val="24"/>
-                <w:szCs w:val="24"/>
-              </w:rPr>
-              <w:t xml:space="preserve"> seguro </w:t>
-            </w:r>
-            <w:r>
-              <w:rPr>
-                <w:color w:val="000000"/>
-                <w:sz w:val="24"/>
-                <w:szCs w:val="24"/>
-              </w:rPr>
-              <w:t xml:space="preserve">en la construcción de </w:t>
-            </w:r>
-            <w:proofErr w:type="spellStart"/>
-            <w:r>
-              <w:rPr>
-                <w:color w:val="000000"/>
-                <w:sz w:val="24"/>
-                <w:szCs w:val="24"/>
-              </w:rPr>
-              <w:t>APIs</w:t>
-            </w:r>
-            <w:proofErr w:type="spellEnd"/>
-            <w:r>
-              <w:rPr>
-                <w:color w:val="000000"/>
-                <w:sz w:val="24"/>
-                <w:szCs w:val="24"/>
-              </w:rPr>
-              <w:t xml:space="preserve"> con FastAPI, </w:t>
-            </w:r>
-            <w:r>
-              <w:rPr>
-                <w:color w:val="000000"/>
-                <w:sz w:val="24"/>
-                <w:szCs w:val="24"/>
-              </w:rPr>
-              <w:t>respaldado por mi formación en</w:t>
-            </w:r>
-            <w:r>
-              <w:rPr>
-                <w:color w:val="000000"/>
-                <w:sz w:val="24"/>
-                <w:szCs w:val="24"/>
-              </w:rPr>
-              <w:t xml:space="preserve"> Desarrollo de Software, Arquitectura, Gestión de Proyectos Informáticos, Gestión de Riesgos, Calidad de Software y Seguridad en Sistemas, además de mis certificaciones de Duoc UC, Google y Universidad Austral.</w:t>
+              <w:t xml:space="preserve"> Considero que tengo más desarrolladas las competencias asociadas al desarrollo de software sistemático, el modelamiento de datos y sistemas de información clínica, y la gestión de proyectos. Me siento seguro en la construcción de APIs con FastAPI, respaldado por mi formación en Desarrollo de Software, Arquitectura, Gestión de Proyectos Informáticos, Gestión de Riesgos, Calidad de Software y Seguridad en Sistemas, además de mis certificaciones de Duoc UC, Google y Universidad Austral.</w:t>
             </w:r>
           </w:p>
           <w:p>
@@ -1331,7 +951,7 @@
                 <w:sz w:val="24"/>
                 <w:szCs w:val="24"/>
               </w:rPr>
-              <w:t>Asimismo, me siento fuerte en gestión de proyectos, ya que he aplicado Scrum de forma individual, manteniendo sprints, backlog, revisión de avances, control de versiones y documentación. También he desarrollado confianza en pruebas de calidad, mediante simuladores de sensores, pruebas de carga con Locust y evaluación de usabilidad con Escala SUS.</w:t>
+              <w:t>Asimismo, me siento fuerte en gestión de proyectos, ya que he aplicado Scrum de forma individual, manteniendo sprints, backlog, revisión de avances, control de versiones y documentación. En pruebas de calidad he comenzado a avanzar con un simulador de sensores y un plan de pruebas, pero las pruebas de carga, la automatización de pruebas y la seguridad aplicada son aspectos que todavía debo fortalecer.</w:t>
             </w:r>
           </w:p>
           <w:p>
@@ -1358,137 +978,7 @@
                 <w:sz w:val="24"/>
                 <w:szCs w:val="24"/>
               </w:rPr>
-              <w:t xml:space="preserve"> De manera honesta, identifico como desafíos</w:t>
-            </w:r>
-            <w:r>
-              <w:rPr>
-                <w:color w:val="000000"/>
-                <w:sz w:val="24"/>
-                <w:szCs w:val="24"/>
-              </w:rPr>
-              <w:t xml:space="preserve"> el desarrollo </w:t>
-            </w:r>
-            <w:proofErr w:type="spellStart"/>
-            <w:r>
-              <w:rPr>
-                <w:color w:val="000000"/>
-                <w:sz w:val="24"/>
-                <w:szCs w:val="24"/>
-              </w:rPr>
-              <w:t>frontend</w:t>
-            </w:r>
-            <w:proofErr w:type="spellEnd"/>
-            <w:r>
-              <w:rPr>
-                <w:color w:val="000000"/>
-                <w:sz w:val="24"/>
-                <w:szCs w:val="24"/>
-              </w:rPr>
-              <w:t xml:space="preserve">, machine </w:t>
-            </w:r>
-            <w:proofErr w:type="spellStart"/>
-            <w:r>
-              <w:rPr>
-                <w:color w:val="000000"/>
-                <w:sz w:val="24"/>
-                <w:szCs w:val="24"/>
-              </w:rPr>
-              <w:t>learning</w:t>
-            </w:r>
-            <w:proofErr w:type="spellEnd"/>
-            <w:r>
-              <w:rPr>
-                <w:color w:val="000000"/>
-                <w:sz w:val="24"/>
-                <w:szCs w:val="24"/>
-              </w:rPr>
-              <w:t>/</w:t>
-            </w:r>
-            <w:proofErr w:type="spellStart"/>
-            <w:r>
-              <w:rPr>
-                <w:color w:val="000000"/>
-                <w:sz w:val="24"/>
-                <w:szCs w:val="24"/>
-              </w:rPr>
-              <w:t>deep</w:t>
-            </w:r>
-            <w:proofErr w:type="spellEnd"/>
-            <w:r>
-              <w:rPr>
-                <w:color w:val="000000"/>
-                <w:sz w:val="24"/>
-                <w:szCs w:val="24"/>
-              </w:rPr>
-              <w:t xml:space="preserve"> </w:t>
-            </w:r>
-            <w:proofErr w:type="spellStart"/>
-            <w:r>
-              <w:rPr>
-                <w:color w:val="000000"/>
-                <w:sz w:val="24"/>
-                <w:szCs w:val="24"/>
-              </w:rPr>
-              <w:t>learning</w:t>
-            </w:r>
-            <w:proofErr w:type="spellEnd"/>
-            <w:r>
-              <w:rPr>
-                <w:color w:val="000000"/>
-                <w:sz w:val="24"/>
-                <w:szCs w:val="24"/>
-              </w:rPr>
-              <w:t xml:space="preserve"> e interoperabilidad clínica avanzada. Aunque he trabajado con React para el </w:t>
-            </w:r>
-            <w:proofErr w:type="spellStart"/>
-            <w:r>
-              <w:rPr>
-                <w:color w:val="000000"/>
-                <w:sz w:val="24"/>
-                <w:szCs w:val="24"/>
-              </w:rPr>
-              <w:t>dashboard</w:t>
-            </w:r>
-            <w:proofErr w:type="spellEnd"/>
-            <w:r>
-              <w:rPr>
-                <w:color w:val="000000"/>
-                <w:sz w:val="24"/>
-                <w:szCs w:val="24"/>
-              </w:rPr>
-              <w:t xml:space="preserve"> de DomoVida, necesito profundizar en manejo de estado avanzado y optimización de rendimiento. </w:t>
-            </w:r>
-            <w:r>
-              <w:rPr>
-                <w:color w:val="000000"/>
-                <w:sz w:val="24"/>
-                <w:szCs w:val="24"/>
-              </w:rPr>
-              <w:t xml:space="preserve">En inteligencia artificial, el salto hacia redes neuronales LSTM para la predicción de caídas representa un desafío técnico que requiere mayor estudio y práctica. Finalmente, aunque cuento con </w:t>
-            </w:r>
-            <w:r>
-              <w:rPr>
-                <w:color w:val="000000"/>
-                <w:sz w:val="24"/>
-                <w:szCs w:val="24"/>
-              </w:rPr>
-              <w:t>bases sólidas</w:t>
-            </w:r>
-            <w:r>
-              <w:rPr>
-                <w:color w:val="000000"/>
-                <w:sz w:val="24"/>
-                <w:szCs w:val="24"/>
-              </w:rPr>
-              <w:t xml:space="preserve"> en HL7 FHIR,</w:t>
-            </w:r>
-            <w:r>
-              <w:rPr>
-                <w:color w:val="000000"/>
-                <w:sz w:val="24"/>
-                <w:szCs w:val="24"/>
-              </w:rPr>
-              <w:t xml:space="preserve"> requiero más experiencia práctica en validación de esquemas e integración con sistemas reales.</w:t>
+              <w:t xml:space="preserve"> De manera honesta, identifico como desafíos el desarrollo frontend, machine learning/deep learning e interoperabilidad clínica avanzada. Aunque he trabajado con React para el dashboard de DomoVida, necesito profundizar en manejo de estado avanzado y optimización de rendimiento. En inteligencia artificial, el salto hacia redes neuronales LSTM para la predicción de caídas representa un desafío técnico que requiere mayor estudio y práctica. Finalmente, aunque cuento con bases sólidas en HL7 FHIR, requiero más experiencia práctica en validación de esquemas e integración con sistemas reales.</w:t>
             </w:r>
           </w:p>
           <w:p>
@@ -1935,87 +1425,7 @@
                 <w:sz w:val="24"/>
                 <w:szCs w:val="24"/>
               </w:rPr>
-              <w:t xml:space="preserve">Mis principales intereses profesionales se centran en la ingeniería de software aplicada al ámbito de la salud digital e informática biomédica. </w:t>
-            </w:r>
-            <w:r>
-              <w:rPr>
-                <w:color w:val="000000"/>
-                <w:sz w:val="24"/>
-                <w:szCs w:val="24"/>
-              </w:rPr>
-              <w:t xml:space="preserve">Me motiva especialmente </w:t>
-            </w:r>
-            <w:r>
-              <w:rPr>
-                <w:color w:val="000000"/>
-                <w:sz w:val="24"/>
-                <w:szCs w:val="24"/>
-              </w:rPr>
-              <w:t xml:space="preserve">utilizar la tecnología para mejorar la calidad de vida de las personas, </w:t>
-            </w:r>
-            <w:r>
-              <w:rPr>
-                <w:color w:val="000000"/>
-                <w:sz w:val="24"/>
-                <w:szCs w:val="24"/>
-              </w:rPr>
-              <w:t xml:space="preserve">en particular de los </w:t>
-            </w:r>
-            <w:r>
-              <w:rPr>
-                <w:color w:val="000000"/>
-                <w:sz w:val="24"/>
-                <w:szCs w:val="24"/>
-              </w:rPr>
-              <w:t xml:space="preserve">adultos mayores, mediante soluciones no invasivas, seguras y respetuosas de la privacidad. El desarrollo backend, la arquitectura de sistemas escalables, la interoperabilidad clínica y el análisis de datos son las áreas que más me </w:t>
-            </w:r>
-            <w:r>
-              <w:rPr>
-                <w:color w:val="000000"/>
-                <w:sz w:val="24"/>
-                <w:szCs w:val="24"/>
-              </w:rPr>
-              <w:t>interesan</w:t>
-            </w:r>
-            <w:r>
-              <w:rPr>
-                <w:color w:val="000000"/>
-                <w:sz w:val="24"/>
-                <w:szCs w:val="24"/>
-              </w:rPr>
-              <w:t xml:space="preserve">, y DomoVida me ha permitido </w:t>
-            </w:r>
-            <w:r>
-              <w:rPr>
-                <w:color w:val="000000"/>
-                <w:sz w:val="24"/>
-                <w:szCs w:val="24"/>
-              </w:rPr>
-              <w:t xml:space="preserve">conectar estos intereses con </w:t>
-            </w:r>
-            <w:r>
-              <w:rPr>
-                <w:color w:val="000000"/>
-                <w:sz w:val="24"/>
-                <w:szCs w:val="24"/>
-              </w:rPr>
-              <w:t>un proyecto concreto</w:t>
-            </w:r>
-            <w:r>
-              <w:rPr>
-                <w:color w:val="000000"/>
-                <w:sz w:val="24"/>
-                <w:szCs w:val="24"/>
-              </w:rPr>
-              <w:t>, técnicamente desafiante y</w:t>
-            </w:r>
-            <w:r>
-              <w:rPr>
-                <w:color w:val="000000"/>
-                <w:sz w:val="24"/>
-                <w:szCs w:val="24"/>
-              </w:rPr>
-              <w:t xml:space="preserve"> con impacto social.</w:t>
+              <w:t xml:space="preserve">Mis principales intereses profesionales se centran en la ingeniería de software aplicada al ámbito de la salud digital e informática biomédica. Me motiva especialmente utilizar la tecnología para mejorar la calidad de vida de las personas, en particular de los adultos mayores, mediante soluciones no invasivas, seguras y respetuosas de la privacidad. El desarrollo backend, la arquitectura de sistemas escalables, la interoperabilidad clínica y el análisis de datos son las áreas que más me interesan, y DomoVida me ha permitido conectar estos intereses con un proyecto concreto, técnicamente desafiante y con impacto social.</w:t>
             </w:r>
           </w:p>
           <w:p>
@@ -2146,51 +1556,8 @@
                 <w:szCs w:val="24"/>
               </w:rPr>
               <w:t xml:space="preserve">Las competencias principales relacionadas con mis intereses son el desarrollo de software y sistemas de información en salud, el modelamiento de datos y estándares clínicos, las pruebas de certificación y calidad, la gestión de proyectos y el análisis de datos. Estas competencias están respaldadas por mis </w:t>
-            </w:r>
-            <w:r>
-              <w:rPr>
-                <w:color w:val="000000"/>
-                <w:sz w:val="24"/>
-                <w:szCs w:val="24"/>
-              </w:rPr>
               <w:lastRenderedPageBreak/>
-              <w:t xml:space="preserve">certificaciones de Duoc UC, Google, Universidad Austral, UC, </w:t>
-            </w:r>
-            <w:proofErr w:type="spellStart"/>
-            <w:r>
-              <w:rPr>
-                <w:color w:val="000000"/>
-                <w:sz w:val="24"/>
-                <w:szCs w:val="24"/>
-              </w:rPr>
-              <w:t>UChile</w:t>
-            </w:r>
-            <w:proofErr w:type="spellEnd"/>
-            <w:r>
-              <w:rPr>
-                <w:color w:val="000000"/>
-                <w:sz w:val="24"/>
-                <w:szCs w:val="24"/>
-              </w:rPr>
-              <w:t xml:space="preserve"> y otras instituciones. La competencia que debo fortalecer especialmente es el análisis avanzado de datos y machine </w:t>
-            </w:r>
-            <w:proofErr w:type="spellStart"/>
-            <w:r>
-              <w:rPr>
-                <w:color w:val="000000"/>
-                <w:sz w:val="24"/>
-                <w:szCs w:val="24"/>
-              </w:rPr>
-              <w:t>learning</w:t>
-            </w:r>
-            <w:proofErr w:type="spellEnd"/>
-            <w:r>
-              <w:rPr>
-                <w:color w:val="000000"/>
-                <w:sz w:val="24"/>
-                <w:szCs w:val="24"/>
-              </w:rPr>
-              <w:t>, para desarrollar modelos predictivos más sofisticados, junto con la interoperabilidad clínica avanzada aplicada a sistemas hospitalarios reales.</w:t>
+              <w:t xml:space="preserve">certificaciones de Duoc UC, Google, Universidad Austral, UC, UChile y otras instituciones. La competencia que debo fortalecer especialmente es el análisis avanzado de datos y machine learning, para desarrollar modelos predictivos más sofisticados, junto con la interoperabilidad clínica avanzada aplicada a sistemas hospitalarios reales.</w:t>
             </w:r>
           </w:p>
           <w:p>
@@ -2333,131 +1700,7 @@
                 <w:sz w:val="24"/>
                 <w:szCs w:val="24"/>
               </w:rPr>
-              <w:t xml:space="preserve">En cinco años más me visualizo como un ingeniero de software líder en el ámbito de la salud digital, </w:t>
-            </w:r>
-            <w:r>
-              <w:rPr>
-                <w:color w:val="000000"/>
-                <w:sz w:val="24"/>
-                <w:szCs w:val="24"/>
-              </w:rPr>
-              <w:t xml:space="preserve">liderando equipos de desarrollo en </w:t>
-            </w:r>
-            <w:proofErr w:type="gramStart"/>
-            <w:r>
-              <w:rPr>
-                <w:color w:val="000000"/>
-                <w:sz w:val="24"/>
-                <w:szCs w:val="24"/>
-              </w:rPr>
-              <w:t>una startup</w:t>
-            </w:r>
-            <w:proofErr w:type="gramEnd"/>
-            <w:r>
-              <w:rPr>
-                <w:color w:val="000000"/>
-                <w:sz w:val="24"/>
-                <w:szCs w:val="24"/>
-              </w:rPr>
-              <w:t xml:space="preserve"> </w:t>
-            </w:r>
-            <w:proofErr w:type="spellStart"/>
-            <w:r>
-              <w:rPr>
-                <w:color w:val="000000"/>
-                <w:sz w:val="24"/>
-                <w:szCs w:val="24"/>
-              </w:rPr>
-              <w:t>health-tech</w:t>
-            </w:r>
-            <w:proofErr w:type="spellEnd"/>
-            <w:r>
-              <w:rPr>
-                <w:color w:val="000000"/>
-                <w:sz w:val="24"/>
-                <w:szCs w:val="24"/>
-              </w:rPr>
-              <w:t xml:space="preserve"> o en una institución de salud. Me gustaría </w:t>
-            </w:r>
-            <w:r>
-              <w:rPr>
-                <w:color w:val="000000"/>
-                <w:sz w:val="24"/>
-                <w:szCs w:val="24"/>
-              </w:rPr>
-              <w:t>estar diseñando</w:t>
-            </w:r>
-            <w:r>
-              <w:rPr>
-                <w:color w:val="000000"/>
-                <w:sz w:val="24"/>
-                <w:szCs w:val="24"/>
-              </w:rPr>
-              <w:t xml:space="preserve"> y </w:t>
-            </w:r>
-            <w:r>
-              <w:rPr>
-                <w:color w:val="000000"/>
-                <w:sz w:val="24"/>
-                <w:szCs w:val="24"/>
-              </w:rPr>
-              <w:t>construyendo</w:t>
-            </w:r>
-            <w:r>
-              <w:rPr>
-                <w:color w:val="000000"/>
-                <w:sz w:val="24"/>
-                <w:szCs w:val="24"/>
-              </w:rPr>
-              <w:t xml:space="preserve"> plataformas IoT y de telemedicina que integren inteligencia artificial para anticipar riesgos y mejorar la atención domiciliaria. También me interesa colaborar con organismos públicos como CENS o SENAMA para aportar a </w:t>
-            </w:r>
-            <w:r>
-              <w:rPr>
-                <w:color w:val="000000"/>
-                <w:sz w:val="24"/>
-                <w:szCs w:val="24"/>
-              </w:rPr>
-              <w:t xml:space="preserve">la definición de </w:t>
-            </w:r>
-            <w:r>
-              <w:rPr>
-                <w:color w:val="000000"/>
-                <w:sz w:val="24"/>
-                <w:szCs w:val="24"/>
-              </w:rPr>
-              <w:t xml:space="preserve">estándares de interoperabilidad y buenas prácticas en salud digital, </w:t>
-            </w:r>
-            <w:r>
-              <w:rPr>
-                <w:color w:val="000000"/>
-                <w:sz w:val="24"/>
-                <w:szCs w:val="24"/>
-              </w:rPr>
-              <w:t>manteniendo una</w:t>
-            </w:r>
-            <w:r>
-              <w:rPr>
-                <w:color w:val="000000"/>
-                <w:sz w:val="24"/>
-                <w:szCs w:val="24"/>
-              </w:rPr>
-              <w:t xml:space="preserve"> formación </w:t>
-            </w:r>
-            <w:r>
-              <w:rPr>
-                <w:color w:val="000000"/>
-                <w:sz w:val="24"/>
-                <w:szCs w:val="24"/>
-              </w:rPr>
-              <w:t xml:space="preserve">continua </w:t>
-            </w:r>
-            <w:r>
-              <w:rPr>
-                <w:color w:val="000000"/>
-                <w:sz w:val="24"/>
-                <w:szCs w:val="24"/>
-              </w:rPr>
-              <w:t>en inteligencia artificial aplicada a la salud.</w:t>
+              <w:t xml:space="preserve">En cinco años más me visualizo como un ingeniero de software líder en el ámbito de la salud digital, liderando equipos de desarrollo en una startup health-tech o en una institución de salud. Me gustaría estar diseñando y construyendo plataformas IoT y de telemedicina que integren inteligencia artificial para anticipar riesgos y mejorar la atención domiciliaria. También me interesa colaborar con organismos públicos como CENS o SENAMA para aportar a la definición de estándares de interoperabilidad y buenas prácticas en salud digital, manteniendo una formación continua en inteligencia artificial aplicada a la salud.</w:t>
             </w:r>
           </w:p>
           <w:p>
@@ -2782,55 +2025,7 @@
                 <w:szCs w:val="24"/>
               </w:rPr>
               <w:lastRenderedPageBreak/>
-              <w:t xml:space="preserve">Sí, el proyecto DomoVida se relaciona directamente con mis proyecciones profesionales actuales y con mi formación en Ingeniería en Informática, potenciada por mi título en Informática Biomédica y mis certificaciones complementarias. </w:t>
-            </w:r>
-            <w:r>
-              <w:rPr>
-                <w:color w:val="000000"/>
-                <w:sz w:val="24"/>
-                <w:szCs w:val="24"/>
-              </w:rPr>
-              <w:t>DomoVida es la evolución natural de mi interés por la salud digital, y mi formación en Ingeniería en Informática ha sido el pilar fundamental para su diseño. El proyecto que había diseñado previamente</w:t>
-            </w:r>
-            <w:r>
-              <w:rPr>
-                <w:color w:val="000000"/>
-                <w:sz w:val="24"/>
-                <w:szCs w:val="24"/>
-              </w:rPr>
-              <w:t xml:space="preserve"> apuntaba en esta dirección, pero </w:t>
-            </w:r>
-            <w:r>
-              <w:rPr>
-                <w:color w:val="000000"/>
-                <w:sz w:val="24"/>
-                <w:szCs w:val="24"/>
-              </w:rPr>
-              <w:t>ahora se</w:t>
-            </w:r>
-            <w:r>
-              <w:rPr>
-                <w:color w:val="000000"/>
-                <w:sz w:val="24"/>
-                <w:szCs w:val="24"/>
-              </w:rPr>
-              <w:t xml:space="preserve"> ha perfeccionado y ampliado, incorporando desarrollo backend, arquitectura, gestión de proyectos, sistemas de información en salud, interoperabilidad, inteligencia artificial, cumplimiento normativo y usabilidad validada. No requiere un cambio de rumbo, sino un refinamiento y una profundización técnica</w:t>
-            </w:r>
-            <w:r>
-              <w:rPr>
-                <w:color w:val="000000"/>
-                <w:sz w:val="24"/>
-                <w:szCs w:val="24"/>
-              </w:rPr>
-              <w:t xml:space="preserve"> coherente con mi trayectoria</w:t>
-            </w:r>
-            <w:r>
-              <w:rPr>
-                <w:color w:val="000000"/>
-                <w:sz w:val="24"/>
-                <w:szCs w:val="24"/>
-              </w:rPr>
-              <w:t>.</w:t>
+              <w:t xml:space="preserve">Sí, el proyecto DomoVida se relaciona directamente con mis proyecciones profesionales actuales y con mi formación en Ingeniería en Informática, potenciada por mi título en Informática Biomédica y mis certificaciones complementarias. DomoVida es la evolución natural de mi interés por la salud digital, y mi formación en Ingeniería en Informática ha sido el pilar fundamental para su diseño. El proyecto que había diseñado previamente apuntaba en esta dirección, pero ahora se ha perfeccionado y ampliado, incorporando desarrollo backend, arquitectura, gestión de proyectos, sistemas de información en salud, interoperabilidad, inteligencia artificial, cumplimiento normativo y validación de usabilidad con usuarios. No requiere un cambio de rumbo, sino un refinamiento y una profundización técnica coherente con mi trayectoria.</w:t>
             </w:r>
           </w:p>
           <w:p>
@@ -3134,127 +2329,7 @@
                 <w:sz w:val="24"/>
                 <w:szCs w:val="24"/>
               </w:rPr>
-              <w:t xml:space="preserve"> </w:t>
-            </w:r>
-            <w:r>
-              <w:rPr>
-                <w:color w:val="000000"/>
-                <w:sz w:val="24"/>
-                <w:szCs w:val="24"/>
-              </w:rPr>
-              <w:t xml:space="preserve">Un proyecto como DomoVida, que combina tecnología de punta con un propósito social claro, es el tipo de experiencia que más aporta a mi desarrollo profesional. Me permite consolidar competencias técnicas avanzadas, </w:t>
-            </w:r>
-            <w:r>
-              <w:rPr>
-                <w:color w:val="000000"/>
-                <w:sz w:val="24"/>
-                <w:szCs w:val="24"/>
-              </w:rPr>
-              <w:t xml:space="preserve">aplicar conocimientos de salud digital e interoperabilidad, </w:t>
-            </w:r>
-            <w:r>
-              <w:rPr>
-                <w:color w:val="000000"/>
-                <w:sz w:val="24"/>
-                <w:szCs w:val="24"/>
-              </w:rPr>
-              <w:t xml:space="preserve">comprender marcos normativos </w:t>
-            </w:r>
-            <w:r>
-              <w:rPr>
-                <w:color w:val="000000"/>
-                <w:sz w:val="24"/>
-                <w:szCs w:val="24"/>
-              </w:rPr>
-              <w:t>y</w:t>
-            </w:r>
-            <w:r>
-              <w:rPr>
-                <w:color w:val="000000"/>
-                <w:sz w:val="24"/>
-                <w:szCs w:val="24"/>
-              </w:rPr>
-              <w:t xml:space="preserve"> trabajar con necesidades reales de usuarios finales </w:t>
-            </w:r>
-            <w:r>
-              <w:rPr>
-                <w:color w:val="000000"/>
-                <w:sz w:val="24"/>
-                <w:szCs w:val="24"/>
-              </w:rPr>
-              <w:t>como adultos mayores, cuidadores y familias.</w:t>
-            </w:r>
-            <w:r>
-              <w:rPr>
-                <w:color w:val="000000"/>
-                <w:sz w:val="24"/>
-                <w:szCs w:val="24"/>
-              </w:rPr>
-              <w:t xml:space="preserve"> Además, al </w:t>
-            </w:r>
-            <w:r>
-              <w:rPr>
-                <w:color w:val="000000"/>
-                <w:sz w:val="24"/>
-                <w:szCs w:val="24"/>
-              </w:rPr>
-              <w:t xml:space="preserve">tener una </w:t>
-            </w:r>
-            <w:r>
-              <w:rPr>
-                <w:color w:val="000000"/>
-                <w:sz w:val="24"/>
-                <w:szCs w:val="24"/>
-              </w:rPr>
-              <w:t xml:space="preserve">orientación de código abierto y potencial </w:t>
-            </w:r>
-            <w:r>
-              <w:rPr>
-                <w:color w:val="000000"/>
-                <w:sz w:val="24"/>
-                <w:szCs w:val="24"/>
-              </w:rPr>
-              <w:t xml:space="preserve">de </w:t>
-            </w:r>
-            <w:r>
-              <w:rPr>
-                <w:color w:val="000000"/>
-                <w:sz w:val="24"/>
-                <w:szCs w:val="24"/>
-              </w:rPr>
-              <w:t xml:space="preserve">postulación a fondos como Corfo o Sercotec, me ayuda a comprender cómo llevar una idea desde el prototipo </w:t>
-            </w:r>
-            <w:r>
-              <w:rPr>
-                <w:color w:val="000000"/>
-                <w:sz w:val="24"/>
-                <w:szCs w:val="24"/>
-              </w:rPr>
-              <w:t xml:space="preserve">académico </w:t>
-            </w:r>
-            <w:r>
-              <w:rPr>
-                <w:color w:val="000000"/>
-                <w:sz w:val="24"/>
-                <w:szCs w:val="24"/>
-              </w:rPr>
-              <w:t xml:space="preserve">hasta una solución </w:t>
-            </w:r>
-            <w:r>
-              <w:rPr>
-                <w:color w:val="000000"/>
-                <w:sz w:val="24"/>
-                <w:szCs w:val="24"/>
-              </w:rPr>
-              <w:t xml:space="preserve">escalable </w:t>
-            </w:r>
-            <w:r>
-              <w:rPr>
-                <w:color w:val="000000"/>
-                <w:sz w:val="24"/>
-                <w:szCs w:val="24"/>
-              </w:rPr>
-              <w:t>con impacto real.</w:t>
+              <w:t xml:space="preserve"> Un proyecto como DomoVida, que combina tecnología de punta con un propósito social claro, es el tipo de experiencia que más aporta a mi desarrollo profesional. Me permite consolidar competencias técnicas avanzadas, aplicar conocimientos de salud digital e interoperabilidad, comprender marcos normativos y trabajar con necesidades reales de usuarios finales como adultos mayores, cuidadores y familias. Además, al tener una orientación de código abierto y potencial de postulación a fondos como Corfo o Sercotec, me ayuda a comprender cómo llevar una idea desde el prototipo académico hasta una solución escalable con impacto real.</w:t>
             </w:r>
           </w:p>
           <w:p>
@@ -3281,104 +2356,9 @@
                 <w:sz w:val="24"/>
                 <w:szCs w:val="24"/>
               </w:rPr>
-              <w:t xml:space="preserve"> </w:t>
-            </w:r>
-            <w:r>
-              <w:rPr>
-                <w:color w:val="000000"/>
-                <w:sz w:val="24"/>
-                <w:szCs w:val="24"/>
-              </w:rPr>
-              <w:t xml:space="preserve">El Proyecto APT se sitúa en el contexto de la salud digital y el cuidado domiciliario del adulto mayor en Chile, en un </w:t>
-            </w:r>
-            <w:r>
-              <w:rPr>
-                <w:color w:val="000000"/>
-                <w:sz w:val="24"/>
-                <w:szCs w:val="24"/>
-              </w:rPr>
-              <w:t>escenario</w:t>
-            </w:r>
-            <w:r>
-              <w:rPr>
-                <w:color w:val="000000"/>
-                <w:sz w:val="24"/>
-                <w:szCs w:val="24"/>
-              </w:rPr>
-              <w:t xml:space="preserve"> de envejecimiento poblacional, necesidad de soluciones no invasivas, desafíos de conectividad y exigencias éticas sobre el uso de datos. </w:t>
-            </w:r>
-            <w:r>
-              <w:rPr>
-                <w:color w:val="000000"/>
-                <w:sz w:val="24"/>
-                <w:szCs w:val="24"/>
-              </w:rPr>
-              <w:t xml:space="preserve">Aunque </w:t>
-            </w:r>
-            <w:r>
-              <w:rPr>
-                <w:color w:val="000000"/>
-                <w:sz w:val="24"/>
-                <w:szCs w:val="24"/>
-              </w:rPr>
+              <w:t xml:space="preserve"> El Proyecto APT se sitúa en el contexto de la salud digital y el cuidado domiciliario del adulto mayor en Chile, en un escenario de envejecimiento poblacional, necesidad de soluciones no invasivas, desafíos de conectividad y exigencias éticas sobre el uso de datos. Aunque </w:t>
               <w:lastRenderedPageBreak/>
-              <w:t>nace</w:t>
-            </w:r>
-            <w:r>
-              <w:rPr>
-                <w:color w:val="000000"/>
-                <w:sz w:val="24"/>
-                <w:szCs w:val="24"/>
-              </w:rPr>
-              <w:t xml:space="preserve"> en un entorno académico, </w:t>
-            </w:r>
-            <w:r>
-              <w:rPr>
-                <w:color w:val="000000"/>
-                <w:sz w:val="24"/>
-                <w:szCs w:val="24"/>
-              </w:rPr>
-              <w:t>tiene una clara</w:t>
-            </w:r>
-            <w:r>
-              <w:rPr>
-                <w:color w:val="000000"/>
-                <w:sz w:val="24"/>
-                <w:szCs w:val="24"/>
-              </w:rPr>
-              <w:t xml:space="preserve"> proyección </w:t>
-            </w:r>
-            <w:r>
-              <w:rPr>
-                <w:color w:val="000000"/>
-                <w:sz w:val="24"/>
-                <w:szCs w:val="24"/>
-              </w:rPr>
-              <w:t>hacia el</w:t>
-            </w:r>
-            <w:r>
-              <w:rPr>
-                <w:color w:val="000000"/>
-                <w:sz w:val="24"/>
-                <w:szCs w:val="24"/>
-              </w:rPr>
-              <w:t xml:space="preserve"> mundo real mediante posibles alianzas con SENAMA, CENS, municipalidades y fondos públicos. En este contexto, la ingeniería se pone al servicio de un problema país, integrando informática, salud digital, análisis de datos, interoperabilidad y gestión de proyectos</w:t>
-            </w:r>
-            <w:r>
-              <w:rPr>
-                <w:color w:val="000000"/>
-                <w:sz w:val="24"/>
-                <w:szCs w:val="24"/>
-              </w:rPr>
-              <w:t xml:space="preserve"> en una propuesta tecnológica robusta, ética y socialmente pertinente</w:t>
-            </w:r>
-            <w:r>
-              <w:rPr>
-                <w:color w:val="000000"/>
-                <w:sz w:val="24"/>
-                <w:szCs w:val="24"/>
-              </w:rPr>
-              <w:t>.</w:t>
+              <w:t xml:space="preserve">nace en un entorno académico, tiene una clara proyección hacia el mundo real mediante posibles alianzas con SENAMA, CENS, municipalidades y fondos públicos. En este contexto, la ingeniería se pone al servicio de un problema país, integrando informática, salud digital, análisis de datos, interoperabilidad y gestión de proyectos en una propuesta tecnológica robusta, ética y socialmente pertinente.</w:t>
             </w:r>
           </w:p>
           <w:p>

</xml_diff>